<commit_message>
docs(handover): correct stale statuses and broken links in S1 handovers
- TV1: PR column now shows #11/#16/#17 merged, Trello checklist state, current test count
- TV2: PR #19 merged into develop (was "not merged")
- TV3 (RAG baseline): PR #23 merged; AGENTS.md link points to docs/AGENTS.md
- Sprint 1 report: note the corrections; remove the now-fixed link debt row
- Only verifiable facts changed; authors' evaluations and results untouched. docx regenerated.

Co-Authored-By: Claude Sonnet 5.5 <noreply@anthropic.com>
</commit_message>
<xml_diff>
--- a/docs/export/handover/2026-10-19_s1-tv1_nen-tang-va-cau-hinh.docx
+++ b/docs/export/handover/2026-10-19_s1-tv1_nen-tang-va-cau-hinh.docx
@@ -186,7 +186,7 @@
               <w:rPr>
                 <w:sz w:val="19"/>
               </w:rPr>
-              <w:t xml:space="preserve">4 thẻ đã merge vào </w:t>
+              <w:t xml:space="preserve">Cả 4 thẻ và các bản sửa/cập nhật liên quan đã merge vào </w:t>
             </w:r>
             <w:r>
               <w:rPr>
@@ -199,14 +199,7 @@
               <w:rPr>
                 <w:sz w:val="19"/>
               </w:rPr>
-              <w:t xml:space="preserve">; bản sửa lỗi + tài liệu này nằm ở </w:t>
-            </w:r>
-            <w:r>
-              <w:rPr>
-                <w:rFonts w:ascii="Consolas" w:hAnsi="Consolas"/>
-                <w:sz w:val="19"/>
-              </w:rPr>
-              <w:t>fix/s1-tv1-env-config-cleanup</w:t>
+              <w:t xml:space="preserve"> (PR #8–#11, #16, #17); xem trạng thái Trello ở bảng dưới</w:t>
             </w:r>
           </w:p>
         </w:tc>
@@ -574,7 +567,7 @@
               <w:rPr>
                 <w:sz w:val="19"/>
               </w:rPr>
-              <w:t>4/5 — còn branch protection</w:t>
+              <w:t>5/5 trên Trello; việc bật branch protection nằm trên GitHub, chưa xác minh được từ repo</w:t>
             </w:r>
           </w:p>
         </w:tc>
@@ -661,7 +654,7 @@
               <w:rPr>
                 <w:sz w:val="19"/>
               </w:rPr>
-              <w:t>5/6 — còn "cả 4 thành viên chạy được"</w:t>
+              <w:t>6/6 trên Trello; chưa có bằng chứng từng thành viên chạy được</w:t>
             </w:r>
           </w:p>
         </w:tc>
@@ -814,7 +807,107 @@
               <w:rPr>
                 <w:sz w:val="19"/>
               </w:rPr>
-              <w:t>chưa mở</w:t>
+              <w:t>#11</w:t>
+            </w:r>
+          </w:p>
+        </w:tc>
+        <w:tc>
+          <w:tcPr>
+            <w:tcW w:type="dxa" w:w="2340"/>
+          </w:tcPr>
+          <w:p>
+            <w:pPr>
+              <w:spacing w:before="40" w:after="40"/>
+            </w:pPr>
+            <w:r>
+              <w:rPr>
+                <w:sz w:val="19"/>
+              </w:rPr>
+            </w:r>
+            <w:r>
+              <w:rPr>
+                <w:sz w:val="19"/>
+              </w:rPr>
+              <w:t>—</w:t>
+            </w:r>
+          </w:p>
+        </w:tc>
+      </w:tr>
+      <w:tr>
+        <w:tc>
+          <w:tcPr>
+            <w:tcW w:type="dxa" w:w="2340"/>
+          </w:tcPr>
+          <w:p>
+            <w:pPr>
+              <w:spacing w:before="40" w:after="40"/>
+            </w:pPr>
+            <w:r>
+              <w:rPr>
+                <w:sz w:val="19"/>
+              </w:rPr>
+            </w:r>
+            <w:r>
+              <w:rPr>
+                <w:sz w:val="19"/>
+              </w:rPr>
+              <w:t>Cổng API dev dùng một biến, rồi quy ước không dùng cổng mặc định</w:t>
+            </w:r>
+          </w:p>
+        </w:tc>
+        <w:tc>
+          <w:tcPr>
+            <w:tcW w:type="dxa" w:w="2340"/>
+          </w:tcPr>
+          <w:p>
+            <w:pPr>
+              <w:spacing w:before="40" w:after="40"/>
+            </w:pPr>
+            <w:r>
+              <w:rPr>
+                <w:sz w:val="19"/>
+              </w:rPr>
+            </w:r>
+            <w:r>
+              <w:rPr>
+                <w:rFonts w:ascii="Consolas" w:hAnsi="Consolas"/>
+                <w:sz w:val="19"/>
+              </w:rPr>
+              <w:t>fix/s1-tv1-dev-api-port</w:t>
+            </w:r>
+            <w:r>
+              <w:rPr>
+                <w:sz w:val="19"/>
+              </w:rPr>
+              <w:t xml:space="preserve">, </w:t>
+            </w:r>
+            <w:r>
+              <w:rPr>
+                <w:rFonts w:ascii="Consolas" w:hAnsi="Consolas"/>
+                <w:sz w:val="19"/>
+              </w:rPr>
+              <w:t>feature/s1-tv1-non-default-ports</w:t>
+            </w:r>
+          </w:p>
+        </w:tc>
+        <w:tc>
+          <w:tcPr>
+            <w:tcW w:type="dxa" w:w="2340"/>
+          </w:tcPr>
+          <w:p>
+            <w:pPr>
+              <w:spacing w:before="40" w:after="40"/>
+            </w:pPr>
+            <w:r>
+              <w:rPr>
+                <w:sz w:val="19"/>
+              </w:rPr>
+            </w:r>
+            <w:r>
+              <w:rPr>
+                <w:sz w:val="19"/>
+              </w:rPr>
+              <w:t>#16, #17</w:t>
             </w:r>
           </w:p>
         </w:tc>
@@ -3714,7 +3807,7 @@
               <w:rPr>
                 <w:sz w:val="19"/>
               </w:rPr>
-              <w:t xml:space="preserve">25 test, không cần service ngoài; mặc định bỏ qua marker </w:t>
+              <w:t xml:space="preserve">Không cần service ngoài; mặc định bỏ qua marker </w:t>
             </w:r>
             <w:r>
               <w:rPr>
@@ -3722,6 +3815,38 @@
                 <w:sz w:val="19"/>
               </w:rPr>
               <w:t>integration</w:t>
+            </w:r>
+            <w:r>
+              <w:rPr>
+                <w:sz w:val="19"/>
+              </w:rPr>
+              <w:t xml:space="preserve">. Tại </w:t>
+            </w:r>
+            <w:r>
+              <w:rPr>
+                <w:rFonts w:ascii="Consolas" w:hAnsi="Consolas"/>
+                <w:sz w:val="19"/>
+              </w:rPr>
+              <w:t>develop</w:t>
+            </w:r>
+            <w:r>
+              <w:rPr>
+                <w:sz w:val="19"/>
+              </w:rPr>
+              <w:t xml:space="preserve"> </w:t>
+            </w:r>
+            <w:r>
+              <w:rPr>
+                <w:rFonts w:ascii="Consolas" w:hAnsi="Consolas"/>
+                <w:sz w:val="19"/>
+              </w:rPr>
+              <w:t>bf71d68</w:t>
+            </w:r>
+            <w:r>
+              <w:rPr>
+                <w:sz w:val="19"/>
+              </w:rPr>
+              <w:t>: 79 passed</w:t>
             </w:r>
           </w:p>
         </w:tc>
@@ -5041,84 +5166,6 @@
                 <w:sz w:val="19"/>
               </w:rPr>
               <w:t>Khi nào</w:t>
-            </w:r>
-          </w:p>
-        </w:tc>
-      </w:tr>
-      <w:tr>
-        <w:tc>
-          <w:tcPr>
-            <w:tcW w:type="dxa" w:w="3120"/>
-          </w:tcPr>
-          <w:p>
-            <w:pPr>
-              <w:spacing w:before="40" w:after="40"/>
-            </w:pPr>
-            <w:r>
-              <w:rPr>
-                <w:sz w:val="19"/>
-              </w:rPr>
-            </w:r>
-            <w:r>
-              <w:rPr>
-                <w:sz w:val="19"/>
-              </w:rPr>
-              <w:t xml:space="preserve">Mở PR </w:t>
-            </w:r>
-            <w:r>
-              <w:rPr>
-                <w:rFonts w:ascii="Consolas" w:hAnsi="Consolas"/>
-                <w:sz w:val="19"/>
-              </w:rPr>
-              <w:t>fix/s1-tv1-env-config-cleanup</w:t>
-            </w:r>
-            <w:r>
-              <w:rPr>
-                <w:sz w:val="19"/>
-              </w:rPr>
-              <w:t>, thành viên khác review, merge</w:t>
-            </w:r>
-          </w:p>
-        </w:tc>
-        <w:tc>
-          <w:tcPr>
-            <w:tcW w:type="dxa" w:w="3120"/>
-          </w:tcPr>
-          <w:p>
-            <w:pPr>
-              <w:spacing w:before="40" w:after="40"/>
-            </w:pPr>
-            <w:r>
-              <w:rPr>
-                <w:sz w:val="19"/>
-              </w:rPr>
-            </w:r>
-            <w:r>
-              <w:rPr>
-                <w:sz w:val="19"/>
-              </w:rPr>
-              <w:t>TV1 + 1 reviewer</w:t>
-            </w:r>
-          </w:p>
-        </w:tc>
-        <w:tc>
-          <w:tcPr>
-            <w:tcW w:type="dxa" w:w="3120"/>
-          </w:tcPr>
-          <w:p>
-            <w:pPr>
-              <w:spacing w:before="40" w:after="40"/>
-            </w:pPr>
-            <w:r>
-              <w:rPr>
-                <w:sz w:val="19"/>
-              </w:rPr>
-            </w:r>
-            <w:r>
-              <w:rPr>
-                <w:sz w:val="19"/>
-              </w:rPr>
-              <w:t>S1</w:t>
             </w:r>
           </w:p>
         </w:tc>

</xml_diff>